<commit_message>
Laudo 52 - Regularizacao
</commit_message>
<xml_diff>
--- a/uploads/Regularizacao_52.docx
+++ b/uploads/Regularizacao_52.docx
@@ -320,7 +320,7 @@
           <w:szCs w:val="24"/>
           <w:lang w:val="pt-BR"/>
         </w:rPr>
-        <w:t xml:space="preserve">TESTE</w:t>
+        <w:t xml:space="preserve">Rua Sem Denominação</w:t>
       </w:r>
     </w:p>
     <w:p>
@@ -353,7 +353,7 @@
           <w:szCs w:val="24"/>
           <w:lang w:val="pt-BR"/>
         </w:rPr>
-        <w:t xml:space="preserve">-15.587332</w:t>
+        <w:t xml:space="preserve">-15.587251</w:t>
       </w:r>
       <w:r>
         <w:rPr>
@@ -371,7 +371,7 @@
           <w:szCs w:val="24"/>
           <w:lang w:val="pt-BR"/>
         </w:rPr>
-        <w:t xml:space="preserve"> -56.090021</w:t>
+        <w:t xml:space="preserve"> -56.090082</w:t>
       </w:r>
       <w:r>
         <w:rPr>
@@ -526,7 +526,7 @@
           <w:szCs w:val="24"/>
           <w:lang w:val="pt-BR"/>
         </w:rPr>
-        <w:t xml:space="preserve">TESTE</w:t>
+        <w:t xml:space="preserve">Rua Sem Denominação</w:t>
       </w:r>
       <w:r>
         <w:rPr>
@@ -626,7 +626,7 @@
           <w:szCs w:val="24"/>
           <w:lang w:val="pt-BR" w:eastAsia="pt-BR"/>
         </w:rPr>
-        <w:t xml:space="preserve">-56.090021</w:t>
+        <w:t xml:space="preserve">-56.090082</w:t>
       </w:r>
       <w:r>
         <w:rPr>
@@ -670,7 +670,7 @@
           <w:szCs w:val="24"/>
           <w:lang w:val="pt-BR" w:eastAsia="pt-BR"/>
         </w:rPr>
-        <w:t xml:space="preserve">-15.587332”</w:t>
+        <w:t xml:space="preserve">-15.587251”</w:t>
       </w:r>
       <w:r>
         <w:rPr>
@@ -973,7 +973,7 @@
           <w:szCs w:val="24"/>
           <w:lang w:val="pt-BR" w:eastAsia="pt-BR"/>
         </w:rPr>
-        <w:t xml:space="preserve">TESTE.</w:t>
+        <w:t xml:space="preserve">Rua Sem Denominação.</w:t>
       </w:r>
     </w:p>
     <w:p>
@@ -1363,7 +1363,7 @@
           <w:szCs w:val="24"/>
           <w:lang w:val="pt-BR" w:eastAsia="pt-BR"/>
         </w:rPr>
-        <w:t xml:space="preserve">24/09/2026</w:t>
+        <w:t xml:space="preserve">24/09/2025</w:t>
       </w:r>
       <w:r>
         <w:rPr>
@@ -1383,7 +1383,7 @@
           <w:szCs w:val="24"/>
           <w:lang w:val="pt-BR" w:eastAsia="pt-BR"/>
         </w:rPr>
-        <w:t xml:space="preserve">TESTE</w:t>
+        <w:t xml:space="preserve">Rua Sem Denominação</w:t>
       </w:r>
       <w:r>
         <w:rPr>
@@ -2505,7 +2505,7 @@
           <w:szCs w:val="18"/>
           <w:lang w:val="pt-BR"/>
         </w:rPr>
-        <w:t xml:space="preserve">Cuiabá/MT, 03/10/2026</w:t>
+        <w:t xml:space="preserve">Cuiabá/MT, 03/10/2025</w:t>
       </w:r>
     </w:p>
     <w:p>

</xml_diff>